<commit_message>
Update resume docx colors from teal to website purple
Replaced all teal accent colors in the downloadable resume:
- 0B7A70 (dark teal text) → 7C4DBD (medium purple)
- 0D9488 (teal borders/accents) → A78BFA (bright violet)

32 color references updated across document.xml and numbering.xml.
Resume now matches the portfolio's purple accent scheme.

Co-Authored-By: Claude Opus 4.6 (1M context) <noreply@anthropic.com>
</commit_message>
<xml_diff>
--- a/public/Raouf_Portfolio_Resume.docx
+++ b/public/Raouf_Portfolio_Resume.docx
@@ -27,7 +27,7 @@
       <w:r>
         <w:rPr>
           <w:rFonts w:ascii="Calibri" w:cs="Calibri" w:eastAsia="Calibri" w:hAnsi="Calibri"/>
-          <w:color w:val="0B7A70"/>
+          <w:color w:val="7C4DBD"/>
           <w:sz w:val="22"/>
           <w:szCs w:val="22"/>
         </w:rPr>
@@ -48,25 +48,7 @@
           <w:sz w:val="18"/>
           <w:szCs w:val="18"/>
         </w:rPr>
-        <w:t xml:space="preserve">Castle Hill, Sydney, NSW  ·  </w:t>
-      </w:r>
-      <w:r>
-        <w:rPr>
-          <w:rFonts w:ascii="Calibri" w:cs="Calibri" w:eastAsia="Calibri" w:hAnsi="Calibri"/>
-          <w:color w:val="64748B"/>
-          <w:sz w:val="18"/>
-          <w:szCs w:val="18"/>
-        </w:rPr>
-        <w:t xml:space="preserve">+61 402 310 686  ·  </w:t>
-      </w:r>
-      <w:r>
-        <w:rPr>
-          <w:rFonts w:ascii="Calibri" w:cs="Calibri" w:eastAsia="Calibri" w:hAnsi="Calibri"/>
-          <w:color w:val="64748B"/>
-          <w:sz w:val="18"/>
-          <w:szCs w:val="18"/>
-        </w:rPr>
-        <w:t xml:space="preserve">raoof.r999@outlook.com</w:t>
+        <w:t>Castle Hill, Sydney, NSW  ·  +61 402 310 686  ·  raoof.r999@outlook.com</w:t>
       </w:r>
     </w:p>
     <w:p>
@@ -86,7 +68,7 @@
     <w:p>
       <w:pPr>
         <w:pBdr>
-          <w:bottom w:val="single" w:color="0D9488" w:sz="6" w:space="4"/>
+          <w:bottom w:val="single" w:color="A78BFA" w:sz="6" w:space="4"/>
         </w:pBdr>
         <w:spacing w:before="320" w:after="100"/>
       </w:pPr>
@@ -129,7 +111,7 @@
     <w:p>
       <w:pPr>
         <w:pBdr>
-          <w:bottom w:val="single" w:color="0D9488" w:sz="6" w:space="4"/>
+          <w:bottom w:val="single" w:color="A78BFA" w:sz="6" w:space="4"/>
         </w:pBdr>
         <w:spacing w:before="320" w:after="100"/>
       </w:pPr>
@@ -164,7 +146,7 @@
           <w:rFonts w:ascii="Calibri" w:cs="Calibri" w:eastAsia="Calibri" w:hAnsi="Calibri"/>
           <w:i/>
           <w:iCs/>
-          <w:color w:val="0B7A70"/>
+          <w:color w:val="7C4DBD"/>
           <w:sz w:val="20"/>
           <w:szCs w:val="20"/>
         </w:rPr>
@@ -174,7 +156,7 @@
     <w:p>
       <w:pPr>
         <w:pBdr>
-          <w:bottom w:val="single" w:color="0D9488" w:sz="6" w:space="4"/>
+          <w:bottom w:val="single" w:color="A78BFA" w:sz="6" w:space="4"/>
         </w:pBdr>
         <w:spacing w:before="320" w:after="100"/>
       </w:pPr>
@@ -353,7 +335,7 @@
     <w:p>
       <w:pPr>
         <w:pBdr>
-          <w:bottom w:val="single" w:color="0D9488" w:sz="6" w:space="4"/>
+          <w:bottom w:val="single" w:color="A78BFA" w:sz="6" w:space="4"/>
         </w:pBdr>
         <w:spacing w:before="320" w:after="100"/>
       </w:pPr>
@@ -388,7 +370,7 @@
           <w:rFonts w:ascii="Consolas" w:cs="Consolas" w:eastAsia="Consolas" w:hAnsi="Consolas"/>
           <w:b/>
           <w:bCs/>
-          <w:color w:val="0B7A70"/>
+          <w:color w:val="7C4DBD"/>
           <w:sz w:val="18"/>
           <w:szCs w:val="18"/>
         </w:rPr>
@@ -413,7 +395,7 @@
           <w:rFonts w:ascii="Consolas" w:cs="Consolas" w:eastAsia="Consolas" w:hAnsi="Consolas"/>
           <w:b/>
           <w:bCs/>
-          <w:color w:val="0B7A70"/>
+          <w:color w:val="7C4DBD"/>
           <w:sz w:val="18"/>
           <w:szCs w:val="18"/>
         </w:rPr>
@@ -438,7 +420,7 @@
           <w:rFonts w:ascii="Consolas" w:cs="Consolas" w:eastAsia="Consolas" w:hAnsi="Consolas"/>
           <w:b/>
           <w:bCs/>
-          <w:color w:val="0B7A70"/>
+          <w:color w:val="7C4DBD"/>
           <w:sz w:val="18"/>
           <w:szCs w:val="18"/>
         </w:rPr>
@@ -463,7 +445,7 @@
           <w:rFonts w:ascii="Consolas" w:cs="Consolas" w:eastAsia="Consolas" w:hAnsi="Consolas"/>
           <w:b/>
           <w:bCs/>
-          <w:color w:val="0B7A70"/>
+          <w:color w:val="7C4DBD"/>
           <w:sz w:val="18"/>
           <w:szCs w:val="18"/>
         </w:rPr>
@@ -488,7 +470,7 @@
           <w:rFonts w:ascii="Consolas" w:cs="Consolas" w:eastAsia="Consolas" w:hAnsi="Consolas"/>
           <w:b/>
           <w:bCs/>
-          <w:color w:val="0B7A70"/>
+          <w:color w:val="7C4DBD"/>
           <w:sz w:val="18"/>
           <w:szCs w:val="18"/>
         </w:rPr>
@@ -513,7 +495,7 @@
           <w:rFonts w:ascii="Consolas" w:cs="Consolas" w:eastAsia="Consolas" w:hAnsi="Consolas"/>
           <w:b/>
           <w:bCs/>
-          <w:color w:val="0B7A70"/>
+          <w:color w:val="7C4DBD"/>
           <w:sz w:val="18"/>
           <w:szCs w:val="18"/>
         </w:rPr>
@@ -532,7 +514,7 @@
     <w:p>
       <w:pPr>
         <w:pBdr>
-          <w:bottom w:val="single" w:color="0D9488" w:sz="6" w:space="4"/>
+          <w:bottom w:val="single" w:color="A78BFA" w:sz="6" w:space="4"/>
         </w:pBdr>
         <w:spacing w:before="320" w:after="100"/>
       </w:pPr>
@@ -579,7 +561,7 @@
       <w:r>
         <w:rPr>
           <w:rFonts w:ascii="Consolas" w:cs="Consolas" w:eastAsia="Consolas" w:hAnsi="Consolas"/>
-          <w:color w:val="0D9488"/>
+          <w:color w:val="A78BFA"/>
           <w:sz w:val="16"/>
           <w:szCs w:val="16"/>
         </w:rPr>
@@ -610,7 +592,7 @@
       <w:r>
         <w:rPr>
           <w:rFonts w:ascii="Consolas" w:cs="Consolas" w:eastAsia="Consolas" w:hAnsi="Consolas"/>
-          <w:color w:val="0B7A70"/>
+          <w:color w:val="7C4DBD"/>
           <w:sz w:val="16"/>
           <w:szCs w:val="16"/>
         </w:rPr>
@@ -652,7 +634,7 @@
       <w:r>
         <w:rPr>
           <w:rFonts w:ascii="Consolas" w:cs="Consolas" w:eastAsia="Consolas" w:hAnsi="Consolas"/>
-          <w:color w:val="0D9488"/>
+          <w:color w:val="A78BFA"/>
           <w:sz w:val="16"/>
           <w:szCs w:val="16"/>
         </w:rPr>
@@ -683,7 +665,7 @@
       <w:r>
         <w:rPr>
           <w:rFonts w:ascii="Consolas" w:cs="Consolas" w:eastAsia="Consolas" w:hAnsi="Consolas"/>
-          <w:color w:val="0B7A70"/>
+          <w:color w:val="7C4DBD"/>
           <w:sz w:val="16"/>
           <w:szCs w:val="16"/>
         </w:rPr>
@@ -725,7 +707,7 @@
       <w:r>
         <w:rPr>
           <w:rFonts w:ascii="Consolas" w:cs="Consolas" w:eastAsia="Consolas" w:hAnsi="Consolas"/>
-          <w:color w:val="0D9488"/>
+          <w:color w:val="A78BFA"/>
           <w:sz w:val="16"/>
           <w:szCs w:val="16"/>
         </w:rPr>
@@ -756,7 +738,7 @@
       <w:r>
         <w:rPr>
           <w:rFonts w:ascii="Consolas" w:cs="Consolas" w:eastAsia="Consolas" w:hAnsi="Consolas"/>
-          <w:color w:val="0B7A70"/>
+          <w:color w:val="7C4DBD"/>
           <w:sz w:val="16"/>
           <w:szCs w:val="16"/>
         </w:rPr>
@@ -798,7 +780,7 @@
       <w:r>
         <w:rPr>
           <w:rFonts w:ascii="Consolas" w:cs="Consolas" w:eastAsia="Consolas" w:hAnsi="Consolas"/>
-          <w:color w:val="0D9488"/>
+          <w:color w:val="A78BFA"/>
           <w:sz w:val="16"/>
           <w:szCs w:val="16"/>
         </w:rPr>
@@ -829,7 +811,7 @@
       <w:r>
         <w:rPr>
           <w:rFonts w:ascii="Consolas" w:cs="Consolas" w:eastAsia="Consolas" w:hAnsi="Consolas"/>
-          <w:color w:val="0B7A70"/>
+          <w:color w:val="7C4DBD"/>
           <w:sz w:val="16"/>
           <w:szCs w:val="16"/>
         </w:rPr>
@@ -871,7 +853,7 @@
       <w:r>
         <w:rPr>
           <w:rFonts w:ascii="Consolas" w:cs="Consolas" w:eastAsia="Consolas" w:hAnsi="Consolas"/>
-          <w:color w:val="0D9488"/>
+          <w:color w:val="A78BFA"/>
           <w:sz w:val="16"/>
           <w:szCs w:val="16"/>
         </w:rPr>
@@ -902,7 +884,7 @@
       <w:r>
         <w:rPr>
           <w:rFonts w:ascii="Consolas" w:cs="Consolas" w:eastAsia="Consolas" w:hAnsi="Consolas"/>
-          <w:color w:val="0B7A70"/>
+          <w:color w:val="7C4DBD"/>
           <w:sz w:val="16"/>
           <w:szCs w:val="16"/>
         </w:rPr>
@@ -944,7 +926,7 @@
       <w:r>
         <w:rPr>
           <w:rFonts w:ascii="Consolas" w:cs="Consolas" w:eastAsia="Consolas" w:hAnsi="Consolas"/>
-          <w:color w:val="0D9488"/>
+          <w:color w:val="A78BFA"/>
           <w:sz w:val="16"/>
           <w:szCs w:val="16"/>
         </w:rPr>
@@ -975,7 +957,7 @@
       <w:r>
         <w:rPr>
           <w:rFonts w:ascii="Consolas" w:cs="Consolas" w:eastAsia="Consolas" w:hAnsi="Consolas"/>
-          <w:color w:val="0B7A70"/>
+          <w:color w:val="7C4DBD"/>
           <w:sz w:val="16"/>
           <w:szCs w:val="16"/>
         </w:rPr>
@@ -1017,7 +999,7 @@
       <w:r>
         <w:rPr>
           <w:rFonts w:ascii="Consolas" w:cs="Consolas" w:eastAsia="Consolas" w:hAnsi="Consolas"/>
-          <w:color w:val="0D9488"/>
+          <w:color w:val="A78BFA"/>
           <w:sz w:val="16"/>
           <w:szCs w:val="16"/>
         </w:rPr>
@@ -1048,7 +1030,7 @@
       <w:r>
         <w:rPr>
           <w:rFonts w:ascii="Consolas" w:cs="Consolas" w:eastAsia="Consolas" w:hAnsi="Consolas"/>
-          <w:color w:val="0B7A70"/>
+          <w:color w:val="7C4DBD"/>
           <w:sz w:val="16"/>
           <w:szCs w:val="16"/>
         </w:rPr>
@@ -1087,7 +1069,7 @@
           <w:rFonts w:ascii="Consolas" w:cs="Consolas" w:eastAsia="Consolas" w:hAnsi="Consolas"/>
           <w:b/>
           <w:bCs/>
-          <w:color w:val="0B7A70"/>
+          <w:color w:val="7C4DBD"/>
           <w:sz w:val="20"/>
           <w:szCs w:val="20"/>
         </w:rPr>
@@ -1097,7 +1079,7 @@
     <w:p>
       <w:pPr>
         <w:pBdr>
-          <w:bottom w:val="single" w:color="0D9488" w:sz="6" w:space="4"/>
+          <w:bottom w:val="single" w:color="A78BFA" w:sz="6" w:space="4"/>
         </w:pBdr>
         <w:spacing w:before="320" w:after="100"/>
       </w:pPr>
@@ -1540,7 +1522,7 @@
     <w:p>
       <w:pPr>
         <w:pBdr>
-          <w:bottom w:val="single" w:color="0D9488" w:sz="6" w:space="4"/>
+          <w:bottom w:val="single" w:color="A78BFA" w:sz="6" w:space="4"/>
         </w:pBdr>
         <w:spacing w:before="320" w:after="100"/>
       </w:pPr>
@@ -1588,7 +1570,7 @@
     <w:p>
       <w:pPr>
         <w:pBdr>
-          <w:bottom w:val="single" w:color="0D9488" w:sz="6" w:space="4"/>
+          <w:bottom w:val="single" w:color="A78BFA" w:sz="6" w:space="4"/>
         </w:pBdr>
         <w:spacing w:before="320" w:after="100"/>
       </w:pPr>
@@ -1846,7 +1828,7 @@
       </w:pPr>
       <w:rPr>
         <w:rFonts w:ascii="Calibri" w:cs="Calibri" w:eastAsia="Calibri" w:hAnsi="Calibri"/>
-        <w:color w:val="0D9488"/>
+        <w:color w:val="A78BFA"/>
       </w:rPr>
     </w:lvl>
   </w:abstractNum>

</xml_diff>

<commit_message>
feat: add both emails to resume page and upload updated resume DOCX
- constants.ts: add CONTACT_EMAIL_GMAIL = "raoof.r12@gmail.com"
- ResumeClient: show both emails (Gmail · Outlook) as mailto links
  in the header contact row
- public/Raouf_Portfolio_Resume.docx: updated with The Invisible Window
  and Project Simurgh project entries

Co-Authored-By: Claude Sonnet 4.6 <noreply@anthropic.com>
</commit_message>
<xml_diff>
--- a/public/Raouf_Portfolio_Resume.docx
+++ b/public/Raouf_Portfolio_Resume.docx
@@ -538,6 +538,152 @@
           <w:szCs w:val="24"/>
         </w:rPr>
         <w:t xml:space="preserve">SELECTED RESEARCH &amp; ENGINEERING PROJECTS</w:t>
+      </w:r>
+    </w:p>
+    <w:p>
+      <w:pPr>
+        <w:tabs>
+          <w:tab w:val="right" w:pos="9026"/>
+        </w:tabs>
+        <w:spacing w:before="120" w:after="10"/>
+      </w:pPr>
+      <w:r>
+        <w:rPr>
+          <w:rFonts w:ascii="Calibri" w:cs="Calibri" w:eastAsia="Calibri" w:hAnsi="Calibri"/>
+          <w:b/>
+          <w:bCs/>
+          <w:color w:val="0F172A"/>
+          <w:sz w:val="20"/>
+          <w:szCs w:val="20"/>
+        </w:rPr>
+        <w:t xml:space="preserve">The Invisible Window</w:t>
+      </w:r>
+      <w:r>
+        <w:rPr>
+          <w:rFonts w:ascii="Consolas" w:cs="Consolas" w:eastAsia="Consolas" w:hAnsi="Consolas"/>
+          <w:color w:val="A78BFA"/>
+          <w:sz w:val="16"/>
+          <w:szCs w:val="16"/>
+        </w:rPr>
+        <w:t xml:space="preserve">  [DEFENSIVE RESEARCH · IEEE PAPER]</w:t>
+      </w:r>
+      <w:r>
+        <w:rPr>
+          <w:rFonts w:ascii="Calibri" w:cs="Calibri" w:eastAsia="Calibri" w:hAnsi="Calibri"/>
+          <w:sz w:val="18"/>
+          <w:szCs w:val="18"/>
+        </w:rPr>
+        <w:t xml:space="preserve">	</w:t>
+      </w:r>
+      <w:r>
+        <w:rPr>
+          <w:rFonts w:ascii="Consolas" w:cs="Consolas" w:eastAsia="Consolas" w:hAnsi="Consolas"/>
+          <w:color w:val="64748B"/>
+          <w:sz w:val="18"/>
+          <w:szCs w:val="18"/>
+        </w:rPr>
+        <w:t xml:space="preserve">2025</w:t>
+      </w:r>
+    </w:p>
+    <w:p>
+      <w:pPr>
+        <w:spacing w:before="0" w:after="10"/>
+      </w:pPr>
+      <w:r>
+        <w:rPr>
+          <w:rFonts w:ascii="Consolas" w:cs="Consolas" w:eastAsia="Consolas" w:hAnsi="Consolas"/>
+          <w:color w:val="7C4DBD"/>
+          <w:sz w:val="16"/>
+          <w:szCs w:val="16"/>
+        </w:rPr>
+        <w:t xml:space="preserve">Windows API · Screen Capture Evasion · Python · IEEE-Format Paper · Responsible Disclosure</w:t>
+      </w:r>
+    </w:p>
+    <w:p>
+      <w:pPr>
+        <w:spacing w:before="0" w:after="40"/>
+      </w:pPr>
+      <w:r>
+        <w:rPr>
+          <w:rFonts w:ascii="Calibri" w:cs="Calibri" w:eastAsia="Calibri" w:hAnsi="Calibri"/>
+          <w:color w:val="475569"/>
+          <w:sz w:val="20"/>
+          <w:szCs w:val="20"/>
+        </w:rPr>
+        <w:t xml:space="preserve">Independently discovered, documented, and responsibly disclosed a cross-platform screen capture vulnerability achieving 100% evasion across all native capture methods on Windows. Published as a 12-page IEEE-format security research paper (DOI: 10.5281/zenodo.20195135). Spans Windows API internals, screen capture pipeline analysis, and evasion technique enumeration. Responsibly disclosed to Microsoft and relevant vendors.</w:t>
+      </w:r>
+    </w:p>
+    <w:p>
+      <w:pPr>
+        <w:tabs>
+          <w:tab w:val="right" w:pos="9026"/>
+        </w:tabs>
+        <w:spacing w:before="120" w:after="10"/>
+      </w:pPr>
+      <w:r>
+        <w:rPr>
+          <w:rFonts w:ascii="Calibri" w:cs="Calibri" w:eastAsia="Calibri" w:hAnsi="Calibri"/>
+          <w:b/>
+          <w:bCs/>
+          <w:color w:val="0F172A"/>
+          <w:sz w:val="20"/>
+          <w:szCs w:val="20"/>
+        </w:rPr>
+        <w:t xml:space="preserve">Project Simurgh</w:t>
+      </w:r>
+      <w:r>
+        <w:rPr>
+          <w:rFonts w:ascii="Consolas" w:cs="Consolas" w:eastAsia="Consolas" w:hAnsi="Consolas"/>
+          <w:color w:val="A78BFA"/>
+          <w:sz w:val="16"/>
+          <w:szCs w:val="16"/>
+        </w:rPr>
+        <w:t xml:space="preserve">  [AI SAFETY TOOLCHAIN]</w:t>
+      </w:r>
+      <w:r>
+        <w:rPr>
+          <w:rFonts w:ascii="Calibri" w:cs="Calibri" w:eastAsia="Calibri" w:hAnsi="Calibri"/>
+          <w:sz w:val="18"/>
+          <w:szCs w:val="18"/>
+        </w:rPr>
+        <w:t xml:space="preserve">	</w:t>
+      </w:r>
+      <w:r>
+        <w:rPr>
+          <w:rFonts w:ascii="Consolas" w:cs="Consolas" w:eastAsia="Consolas" w:hAnsi="Consolas"/>
+          <w:color w:val="64748B"/>
+          <w:sz w:val="18"/>
+          <w:szCs w:val="18"/>
+        </w:rPr>
+        <w:t xml:space="preserve">2026</w:t>
+      </w:r>
+    </w:p>
+    <w:p>
+      <w:pPr>
+        <w:spacing w:before="0" w:after="10"/>
+      </w:pPr>
+      <w:r>
+        <w:rPr>
+          <w:rFonts w:ascii="Consolas" w:cs="Consolas" w:eastAsia="Consolas" w:hAnsi="Consolas"/>
+          <w:color w:val="7C4DBD"/>
+          <w:sz w:val="16"/>
+          <w:szCs w:val="16"/>
+        </w:rPr>
+        <w:t xml:space="preserve">Python · Litestar · React · Supabase · Docker · Terraform · GitHub Actions · CI/CD</w:t>
+      </w:r>
+    </w:p>
+    <w:p>
+      <w:pPr>
+        <w:spacing w:before="0" w:after="40"/>
+      </w:pPr>
+      <w:r>
+        <w:rPr>
+          <w:rFonts w:ascii="Calibri" w:cs="Calibri" w:eastAsia="Calibri" w:hAnsi="Calibri"/>
+          <w:color w:val="475569"/>
+          <w:sz w:val="20"/>
+          <w:szCs w:val="20"/>
+        </w:rPr>
+        <w:t xml:space="preserve">Production AI safety audit pipeline built as a defensive follow-up to “The Invisible Window” research. Comprehensive CI security gates (Bandit, pip-audit, npm audit, secret scanning), Locust load testing, Terraform infrastructure-as-code for reproducible deployments, zero-trust architecture, and Row Level Security. DOI: 10.5281/zenodo.20195198.</w:t>
       </w:r>
     </w:p>
     <w:p>

</xml_diff>

<commit_message>
feat(portfolio): add research papers and resume updates
</commit_message>
<xml_diff>
--- a/public/Raouf_Portfolio_Resume.docx
+++ b/public/Raouf_Portfolio_Resume.docx
@@ -105,7 +105,7 @@
           <w:sz w:val="20"/>
           <w:szCs w:val="20"/>
         </w:rPr>
-        <w:t xml:space="preserve">AI and cybersecurity researcher graduating with a Bachelor of Cyber Security from Macquarie University (November 2026). My work sits at the intersection of artificial intelligence safety and offensive/defensive security — building detection systems that identify threats in real time, evaluating Large Language Model (LLM) outputs for security vulnerabilities, and developing AI-powered tools that make security accessible at scale. I have shipped 70+ independent research and engineering projects, built production systems serving 1,000+ end users, and completed paid AI model evaluation for Anthropic. I bring 7 years of combined experience across security operations, systems programming, and applied machine learning. Fluent in English, Persian (native), and elementary Japanese.</w:t>
+        <w:t>AI and cybersecurity researcher graduating with a Bachelor of Cyber Security from Macquarie University (November 2026). My work sits at the intersection of artificial intelligence safety, privacy-preserving security evidence, and offensive/defensive security — building detection systems, evaluating Large Language Model (LLM) outputs for security and faithfulness, and developing AI-powered tools that make security accessible at scale. Recent research includes Project Simurgh integrity evidence (DOI: 10.5281/zenodo.20549736) and Aion-BibleQA citation-faithfulness evaluation for Bible RAG systems (DOI: 10.5281/zenodo.20522874). I have shipped 70+ independent research and engineering projects, built production systems serving 1,000+ end users, and completed paid AI model evaluation for Anthropic. I bring 7 years of combined experience across security operations, systems programming, and applied machine learning. Fluent in English, Persian (native), and elementary Japanese.</w:t>
       </w:r>
     </w:p>
     <w:p>
@@ -150,7 +150,7 @@
           <w:sz w:val="20"/>
           <w:szCs w:val="20"/>
         </w:rPr>
-        <w:t xml:space="preserve">AI Safety &amp; LLM Security  ·  Threat Detection Engineering  ·  Adversarial Machine Learning  ·  Network Intrusion Detection  ·  Phishing &amp; Social Engineering Simulation  ·  Privacy-Preserving Data Analysis  ·  Secure Software Architecture  ·  Offensive Security &amp; Vulnerability Analysis</w:t>
+        <w:t>AI Safety &amp; LLM Security  ·  Retrieval-Augmented Generation (RAG) Evaluation  ·  Citation Faithfulness  ·  Threat Detection Engineering  ·  Adversarial Machine Learning  ·  Network Intrusion Detection  ·  Privacy-Preserving Data Analysis  ·  Secure Software Architecture  ·  Offensive Security &amp; Vulnerability Analysis</w:t>
       </w:r>
     </w:p>
     <w:p>
@@ -399,16 +399,15 @@
           <w:sz w:val="18"/>
           <w:szCs w:val="18"/>
         </w:rPr>
-        <w:t xml:space="preserve">AI &amp; ML:  </w:t>
-      </w:r>
-      <w:r>
-        <w:rPr>
-          <w:rFonts w:ascii="Calibri" w:cs="Calibri" w:eastAsia="Calibri" w:hAnsi="Calibri"/>
-          <w:color w:val="475569"/>
-          <w:sz w:val="20"/>
-          <w:szCs w:val="20"/>
-        </w:rPr>
-        <w:t xml:space="preserve">LLM evaluation &amp; integration, NLP, classification algorithms, generative AI, prompt engineering, AI model benchmarking, data pipelines for ML applications</w:t>
+        <w:t>AI &amp; ML:  LLM evaluation &amp; integration, RAG evaluation, citation-faithfulness benchmarking, NLP, classification algorithms, generative AI, prompt engineering, AI model benchmarking, data pipelines for ML applications</w:t>
+      </w:r>
+      <w:r>
+        <w:rPr>
+          <w:rFonts w:ascii="Calibri" w:cs="Calibri" w:eastAsia="Calibri" w:hAnsi="Calibri"/>
+          <w:color w:val="475569"/>
+          <w:sz w:val="20"/>
+          <w:szCs w:val="20"/>
+        </w:rPr>
       </w:r>
     </w:p>
     <w:p>
@@ -629,7 +628,9 @@
           <w:sz w:val="20"/>
           <w:szCs w:val="20"/>
         </w:rPr>
-        <w:t xml:space="preserve">Project Simurgh</w:t>
+        <w:t>Project Simurgh  [PRIVACY-PRESERVING INTEGRITY RESEARCH]</w:t>
+        <w:tab/>
+        <w:t>2026</w:t>
       </w:r>
       <w:r>
         <w:rPr>
@@ -638,24 +639,21 @@
           <w:sz w:val="16"/>
           <w:szCs w:val="16"/>
         </w:rPr>
-        <w:t xml:space="preserve">  [AI SAFETY TOOLCHAIN]</w:t>
-      </w:r>
-      <w:r>
-        <w:rPr>
-          <w:rFonts w:ascii="Calibri" w:cs="Calibri" w:eastAsia="Calibri" w:hAnsi="Calibri"/>
-          <w:sz w:val="18"/>
-          <w:szCs w:val="18"/>
-        </w:rPr>
-        <w:t xml:space="preserve">	</w:t>
-      </w:r>
-      <w:r>
-        <w:rPr>
-          <w:rFonts w:ascii="Consolas" w:cs="Consolas" w:eastAsia="Consolas" w:hAnsi="Consolas"/>
-          <w:color w:val="64748B"/>
-          <w:sz w:val="18"/>
-          <w:szCs w:val="18"/>
-        </w:rPr>
-        <w:t xml:space="preserve">2026</w:t>
+      </w:r>
+      <w:r>
+        <w:rPr>
+          <w:rFonts w:ascii="Calibri" w:cs="Calibri" w:eastAsia="Calibri" w:hAnsi="Calibri"/>
+          <w:sz w:val="18"/>
+          <w:szCs w:val="18"/>
+        </w:rPr>
+      </w:r>
+      <w:r>
+        <w:rPr>
+          <w:rFonts w:ascii="Consolas" w:cs="Consolas" w:eastAsia="Consolas" w:hAnsi="Consolas"/>
+          <w:color w:val="64748B"/>
+          <w:sz w:val="18"/>
+          <w:szCs w:val="18"/>
+        </w:rPr>
       </w:r>
     </w:p>
     <w:p>
@@ -669,7 +667,7 @@
           <w:sz w:val="16"/>
           <w:szCs w:val="16"/>
         </w:rPr>
-        <w:t xml:space="preserve">Python · Litestar · React · Supabase · Docker · Terraform · GitHub Actions · CI/CD</w:t>
+        <w:t>Node.js · Express · Browser Telemetry · HMAC Audit Chain · Privacy Engineering · GitHub Actions</w:t>
       </w:r>
     </w:p>
     <w:p>
@@ -683,7 +681,7 @@
           <w:sz w:val="20"/>
           <w:szCs w:val="20"/>
         </w:rPr>
-        <w:t xml:space="preserve">Production AI safety audit pipeline built as a defensive follow-up to “The Invisible Window” research. Comprehensive CI security gates (Bandit, pip-audit, npm audit, secret scanning), Locust load testing, Terraform infrastructure-as-code for reproducible deployments, zero-trust architecture, and Row Level Security. DOI: 10.5281/zenodo.20195198.</w:t>
+        <w:t>Zero-trust integrity API built as a defensive follow-up to The Invisible Window research. Published the main privacy-preserving device-integrity preprint (DOI: 10.5281/zenodo.20374849) and a Phase C voting-adjacent supplement at Macquarie University (DOI: 10.5281/zenodo.20549736). Phase C reported 31 consented sessions, structural ballot-choice exclusion, HMAC-SHA-256 audit chaining, server-side forbidden-field rejection, and 5/5 collection-closure gates.</w:t>
       </w:r>
     </w:p>
     <w:p>
@@ -848,7 +846,9 @@
           <w:sz w:val="20"/>
           <w:szCs w:val="20"/>
         </w:rPr>
-        <w:t xml:space="preserve">PhishPatrol</w:t>
+        <w:t>Aion  [BIBLE RAG RESEARCH]</w:t>
+        <w:tab/>
+        <w:t>2026</w:t>
       </w:r>
       <w:r>
         <w:rPr>
@@ -857,24 +857,21 @@
           <w:sz w:val="16"/>
           <w:szCs w:val="16"/>
         </w:rPr>
-        <w:t xml:space="preserve">  [AI SECURITY]</w:t>
-      </w:r>
-      <w:r>
-        <w:rPr>
-          <w:rFonts w:ascii="Calibri" w:cs="Calibri" w:eastAsia="Calibri" w:hAnsi="Calibri"/>
-          <w:sz w:val="18"/>
-          <w:szCs w:val="18"/>
-        </w:rPr>
-        <w:t xml:space="preserve">	</w:t>
-      </w:r>
-      <w:r>
-        <w:rPr>
-          <w:rFonts w:ascii="Consolas" w:cs="Consolas" w:eastAsia="Consolas" w:hAnsi="Consolas"/>
-          <w:color w:val="64748B"/>
-          <w:sz w:val="18"/>
-          <w:szCs w:val="18"/>
-        </w:rPr>
-        <w:t xml:space="preserve">2024</w:t>
+      </w:r>
+      <w:r>
+        <w:rPr>
+          <w:rFonts w:ascii="Calibri" w:cs="Calibri" w:eastAsia="Calibri" w:hAnsi="Calibri"/>
+          <w:sz w:val="18"/>
+          <w:szCs w:val="18"/>
+        </w:rPr>
+      </w:r>
+      <w:r>
+        <w:rPr>
+          <w:rFonts w:ascii="Consolas" w:cs="Consolas" w:eastAsia="Consolas" w:hAnsi="Consolas"/>
+          <w:color w:val="64748B"/>
+          <w:sz w:val="18"/>
+          <w:szCs w:val="18"/>
+        </w:rPr>
       </w:r>
     </w:p>
     <w:p>
@@ -888,7 +885,7 @@
           <w:sz w:val="16"/>
           <w:szCs w:val="16"/>
         </w:rPr>
-        <w:t xml:space="preserve">Python · Generative AI · NLP</w:t>
+        <w:t>React Native · Expo · Supabase · pgvector · Gemini · OpenAI Embeddings · Tauri v2</w:t>
       </w:r>
     </w:p>
     <w:p>
@@ -902,7 +899,7 @@
           <w:sz w:val="20"/>
           <w:szCs w:val="20"/>
         </w:rPr>
-        <w:t xml:space="preserve">AI-powered phishing simulation and cybersecurity education platform using NLP to generate dynamic, realistic social engineering scenarios. Adopted by 50+ students for interactive security awareness training. Explores LLM misuse vectors for social engineering at scale.</w:t>
+        <w:t>AI-powered Bible companion and verse-grounded RAG research platform. Authored Aion-BibleQA, an 8-page preprint introducing a 40-question benchmark for citation faithfulness and false-premise robustness in Bible RAG systems (DOI: 10.5281/zenodo.20522874). v3 retrieval achieved R@5 = 0.941, mean citation_support = 0.978, zero unsupported citations, and 6/6 false-premise refusals.</w:t>
       </w:r>
     </w:p>
     <w:p>

</xml_diff>